<commit_message>
Fix document generation, Firestore date timestamp crashes and add transfer templates
</commit_message>
<xml_diff>
--- a/public/ĐHKT_QĐ 213- 24052026.Sinh vien.docx
+++ b/public/ĐHKT_QĐ 213- 24052026.Sinh vien.docx
@@ -307,16 +307,6 @@
     </w:tbl>
     <w:p>
       <w:pPr>
-        <w:jc w:val="center"/>
-        <w:rPr>
-          <w:b/>
-          <w:sz w:val="14"/>
-          <w:szCs w:val="14"/>
-        </w:rPr>
-      </w:pPr>
-    </w:p>
-    <w:p>
-      <w:pPr>
         <w:spacing w:before="240"/>
         <w:jc w:val="center"/>
         <w:rPr>
@@ -340,8 +330,8 @@
         <w:rPr>
           <w:b/>
           <w:iCs/>
-          <w:sz w:val="36"/>
-          <w:szCs w:val="36"/>
+          <w:sz w:val="22"/>
+          <w:szCs w:val="22"/>
         </w:rPr>
       </w:pPr>
     </w:p>
@@ -356,7 +346,7 @@
       </w:tblGrid>
       <w:tr>
         <w:trPr>
-          <w:trHeight w:val="863"/>
+          <w:trHeight w:val="567"/>
         </w:trPr>
         <w:tc>
           <w:tcPr>
@@ -397,7 +387,6 @@
           </w:tcPr>
           <w:p>
             <w:pPr>
-              <w:spacing w:line="336" w:lineRule="auto"/>
               <w:rPr>
                 <w:bCs/>
                 <w:sz w:val="28"/>
@@ -448,49 +437,7 @@
             <w:r>
               <w:rPr>
                 <w:bCs/>
-                <w:sz w:val="28"/>
-                <w:szCs w:val="28"/>
-              </w:rPr>
-              <w:t>,</w:t>
-            </w:r>
-          </w:p>
-          <w:p>
-            <w:pPr>
-              <w:spacing w:line="336" w:lineRule="auto"/>
-              <w:rPr>
-                <w:b/>
-                <w:sz w:val="28"/>
-                <w:szCs w:val="28"/>
-              </w:rPr>
-            </w:pPr>
-            <w:r>
-              <w:rPr>
-                <w:bCs/>
-                <w:sz w:val="28"/>
-                <w:szCs w:val="28"/>
-              </w:rPr>
-              <w:t>- Chi bộ</w:t>
-            </w:r>
-            <w:r>
-              <w:rPr>
-                <w:bCs/>
-                <w:sz w:val="28"/>
-                <w:szCs w:val="28"/>
-              </w:rPr>
-              <w:t xml:space="preserve"> </w:t>
-            </w:r>
-            <w:r>
-              <w:rPr>
-                <w:bCs/>
                 <w:noProof/>
-                <w:sz w:val="28"/>
-                <w:szCs w:val="28"/>
-              </w:rPr>
-              <w:t>Mân Quang 4</w:t>
-            </w:r>
-            <w:r>
-              <w:rPr>
-                <w:bCs/>
                 <w:sz w:val="28"/>
                 <w:szCs w:val="28"/>
               </w:rPr>
@@ -503,30 +450,25 @@
     <w:p>
       <w:pPr>
         <w:spacing w:line="312" w:lineRule="auto"/>
-        <w:ind w:firstLine="720"/>
         <w:jc w:val="both"/>
         <w:rPr>
-          <w:sz w:val="16"/>
-          <w:szCs w:val="16"/>
+          <w:sz w:val="28"/>
+          <w:szCs w:val="28"/>
         </w:rPr>
       </w:pPr>
-    </w:p>
-    <w:p>
-      <w:pPr>
-        <w:spacing w:line="312" w:lineRule="auto"/>
-        <w:ind w:firstLine="720"/>
-        <w:jc w:val="both"/>
-        <w:rPr>
-          <w:sz w:val="28"/>
-          <w:szCs w:val="28"/>
-        </w:rPr>
-      </w:pPr>
-      <w:r>
-        <w:rPr>
-          <w:sz w:val="28"/>
-          <w:szCs w:val="28"/>
-        </w:rPr>
-        <w:t>Thực hiện Quy định số 213-QĐ/TW, ngày 02 tháng 01 năm 2020 của Bộ Chính trị về trách nhiệm của đảng viên đang công tác thường xuyên giữ mối liên hệ với tổ chức đảng và nhân dân nơi cư trú.</w:t>
+      <w:r>
+        <w:rPr>
+          <w:sz w:val="28"/>
+          <w:szCs w:val="28"/>
+        </w:rPr>
+        <w:t>T</w:t>
+      </w:r>
+      <w:r>
+        <w:rPr>
+          <w:sz w:val="28"/>
+          <w:szCs w:val="28"/>
+        </w:rPr>
+        <w:t>hực hiện Quy định số 213-QĐ/TW, ngày 02 tháng 01 năm 2020 của Bộ Chính trị về trách nhiệm của đảng viên đang công tác thường xuyên giữ mối liên hệ với tổ chức đảng và nhân dân nơi cư trú.</w:t>
       </w:r>
     </w:p>
     <w:p>

</xml_diff>